<commit_message>
Week 10 sample plan: the new After, a matching standard, the reflection
- Standards: 3.NF.2 (a fraction on the number line), which is what the
  research question asks about; 4.NF.2 kept for the Before. It listed
  only 4.NF.2, the misalignment the Week 9 deck warns against.
- After: three Student Questions, each with how it helps answer the
  research question; the optional 0-to-2 stretch is gone.
- New section, How the feedback shaped my After, with a sample paragraph
  that names a real change and a suggestion set aside.
- Assessment names the sharpest question; Lesson Flow guidance drops
  "artifact" and "a question or two".

Co-Authored-By: Claude Opus 5.5 <noreply@anthropic.com>
</commit_message>
<xml_diff>
--- a/week-10-investigation-plan/week-10-investigation-plan-sample.docx
+++ b/week-10-investigation-plan/week-10-investigation-plan-sample.docx
@@ -568,7 +568,7 @@
               <w:rPr>
                 <w:sz w:val="22"/>
               </w:rPr>
-              <w:t>4.NF.A.2 (compare fractions using a benchmark such as 1/2).</w:t>
+              <w:t xml:space="preserve">3.NF.2 (understand a fraction as a number on the number line). 4.NF.2 (compare fractions using a benchmark such as 1/2), which the Before warms up.</w:t>
             </w:r>
           </w:p>
         </w:tc>
@@ -715,7 +715,7 @@
                 <w:sz w:val="22"/>
                 <w:szCs w:val="22"/>
               </w:rPr>
-              <w:t xml:space="preserve"> • After – the capture: the artifact you collect (an exit slip, a ‘jot how you know’ prompt, a photo of the work or board), plus a question or two that pushes the reasoning one step further</w:t>
+              <w:t xml:space="preserve"> • After – the capture: what you collect at the end (an exit slip of three or more Student Questions, a closing discussion, a photo of the board), each part tied to your research question</w:t>
             </w:r>
             <w:r>
               <w:rPr>
@@ -935,8 +935,106 @@
             <w:r>
               <w:rPr>
                 <w:sz w:val="22"/>
-              </w:rPr>
-              <w:t>Exit slip: place 2/3 on a 0 to 1 line and explain your reasoning about equal parts. Big idea: 3/4 is one number with a fixed spot between 0 and 1. Optional stretch: if the line ran 0 to 2, where would 3/4 go? Where does 5/4 live? ~10 min.</w:t>
+                <w:b/>
+                <w:bCs/>
+              </w:rPr>
+              <w:t xml:space="preserve">Exit slip (~10 min)</w:t>
+            </w:r>
+          </w:p>
+          <w:p>
+            <w:r>
+              <w:rPr>
+                <w:sz w:val="22"/>
+                <w:b/>
+                <w:bCs/>
+              </w:rPr>
+              <w:t xml:space="preserve">Student Question 1: </w:t>
+            </w:r>
+            <w:r>
+              <w:rPr>
+                <w:sz w:val="22"/>
+              </w:rPr>
+              <w:t xml:space="preserve">Place 2/3 on this 0 to 1 line. How did you decide where it goes?</w:t>
+            </w:r>
+          </w:p>
+          <w:p>
+            <w:r>
+              <w:rPr>
+                <w:sz w:val="22"/>
+                <w:i/>
+                <w:iCs/>
+              </w:rPr>
+              <w:t xml:space="preserve">How it helps answer my research question: </w:t>
+            </w:r>
+            <w:r>
+              <w:rPr>
+                <w:sz w:val="22"/>
+              </w:rPr>
+              <w:t xml:space="preserve">A new fraction shows whether a student makes equal parts or counts marks, which is what my question asks.</w:t>
+            </w:r>
+          </w:p>
+          <w:p>
+            <w:r>
+              <w:rPr>
+                <w:sz w:val="22"/>
+                <w:b/>
+                <w:bCs/>
+              </w:rPr>
+              <w:t xml:space="preserve">Student Question 2: </w:t>
+            </w:r>
+            <w:r>
+              <w:rPr>
+                <w:sz w:val="22"/>
+              </w:rPr>
+              <w:t xml:space="preserve">Sam put 2/3 at the second tick mark on a line with five marks. Do you agree? Why or why not?</w:t>
+            </w:r>
+          </w:p>
+          <w:p>
+            <w:r>
+              <w:rPr>
+                <w:sz w:val="22"/>
+                <w:i/>
+                <w:iCs/>
+              </w:rPr>
+              <w:t xml:space="preserve">How it helps answer my research question: </w:t>
+            </w:r>
+            <w:r>
+              <w:rPr>
+                <w:sz w:val="22"/>
+              </w:rPr>
+              <w:t xml:space="preserve">Extra tick marks tempt counting. A student who agrees with Sam is treating 2/3 as a count, not one number.</w:t>
+            </w:r>
+          </w:p>
+          <w:p>
+            <w:r>
+              <w:rPr>
+                <w:sz w:val="22"/>
+                <w:b/>
+                <w:bCs/>
+              </w:rPr>
+              <w:t xml:space="preserve">Student Question 3: </w:t>
+            </w:r>
+            <w:r>
+              <w:rPr>
+                <w:sz w:val="22"/>
+              </w:rPr>
+              <w:t xml:space="preserve">Which is closer to 1, 2/3 or 3/4? Show both on the line.</w:t>
+            </w:r>
+          </w:p>
+          <w:p>
+            <w:r>
+              <w:rPr>
+                <w:sz w:val="22"/>
+                <w:i/>
+                <w:iCs/>
+              </w:rPr>
+              <w:t xml:space="preserve">How it helps answer my research question: </w:t>
+            </w:r>
+            <w:r>
+              <w:rPr>
+                <w:sz w:val="22"/>
+              </w:rPr>
+              <w:t xml:space="preserve">If 3/4 has a fixed spot, a student can compare two spots on the same line, not just two pairs of numbers.</w:t>
             </w:r>
           </w:p>
         </w:tc>
@@ -1053,7 +1151,7 @@
               <w:rPr>
                 <w:sz w:val="22"/>
               </w:rPr>
-              <w:t>In the exit slip, look for whether students mark roughly equal parts and reason about the size of 2/3, or count marks and land anywhere. That is the evidence I read against my question.</w:t>
+              <w:t>In the exit slip, look for whether students mark roughly equal parts and reason about the size of 2/3, or count marks and land anywhere. Question 2 is the sharpest read: agreeing with Sam means counting marks. That is the evidence I read against my question.</w:t>
             </w:r>
           </w:p>
         </w:tc>
@@ -1077,6 +1175,105 @@
         </w:rPr>
       </w:r>
     </w:p>
+    <w:tbl>
+      <w:tblPr>
+        <w:tblStyle w:val="Table6"/>
+        <w:tblW w:w="10890" w:type="dxa"/>
+        <w:jc w:val="start"/>
+        <w:tblInd w:w="-108" w:type="dxa"/>
+        <w:tblLayout w:type="fixed"/>
+        <w:tblCellMar>
+          <w:top w:w="0" w:type="dxa"/>
+          <w:start w:w="108" w:type="dxa"/>
+          <w:bottom w:w="0" w:type="dxa"/>
+          <w:end w:w="108" w:type="dxa"/>
+        </w:tblCellMar>
+        <w:tblLook w:noVBand="1" w:val="07e0"/>
+      </w:tblPr>
+      <w:tblGrid>
+        <w:gridCol w:w="3540"/>
+        <w:gridCol w:w="7350"/>
+      </w:tblGrid>
+      <w:tr>
+        <w:trPr>
+          <w:cantSplit/>
+        </w:trPr>
+        <w:tc>
+          <w:tcPr>
+            <w:tcW w:w="3540" w:type="dxa"/>
+            <w:tcBorders>
+              <w:top w:val="single" w:sz="4" w:space="0" w:color="000000"/>
+              <w:start w:val="single" w:sz="4" w:space="0" w:color="000000"/>
+              <w:bottom w:val="single" w:sz="4" w:space="0" w:color="000000"/>
+              <w:end w:val="single" w:sz="4" w:space="0" w:color="000000"/>
+            </w:tcBorders>
+            <w:shd w:fill="EFEFEF" w:val="clear"/>
+          </w:tcPr>
+          <w:p>
+            <w:pPr>
+              <w:pStyle w:val="normal1"/>
+              <w:widowControl/>
+              <w:spacing w:lineRule="auto" w:line="240" w:before="0" w:after="0"/>
+              <w:jc w:val="start"/>
+              <w:rPr>
+                <w:rFonts w:ascii="Calibri" w:hAnsi="Calibri"/>
+                <w:sz w:val="22"/>
+                <w:szCs w:val="22"/>
+              </w:rPr>
+            </w:pPr>
+            <w:r>
+              <w:rPr>
+                <w:rFonts w:eastAsia="Calibri" w:cs="Calibri" w:ascii="Calibri" w:hAnsi="Calibri"/>
+                <w:b/>
+                <w:bCs/>
+                <w:sz w:val="22"/>
+                <w:szCs w:val="22"/>
+              </w:rPr>
+              <w:t>How the feedback shaped my After</w:t>
+            </w:r>
+          </w:p>
+          <w:p>
+            <w:pPr>
+              <w:pStyle w:val="normal1"/>
+              <w:spacing w:before="0" w:after="200"/>
+              <w:rPr>
+                <w:rFonts w:ascii="Calibri" w:hAnsi="Calibri"/>
+                <w:sz w:val="22"/>
+                <w:szCs w:val="22"/>
+              </w:rPr>
+            </w:pPr>
+            <w:r>
+              <w:rPr>
+                <w:rFonts w:eastAsia="Calibri" w:cs="Calibri" w:ascii="Calibri" w:hAnsi="Calibri"/>
+                <w:sz w:val="22"/>
+                <w:szCs w:val="22"/>
+              </w:rPr>
+              <w:t>How useful were your group’s and the genAI planning partner’s reads as you planned and revised your After? Be specific: what changed from your early drafts, what did you set aside, and why? One paragraph.</w:t>
+            </w:r>
+          </w:p>
+        </w:tc>
+        <w:tc>
+          <w:tcPr>
+            <w:tcW w:w="7350" w:type="dxa"/>
+            <w:tcBorders>
+              <w:top w:val="single" w:sz="4" w:space="0" w:color="000000"/>
+              <w:start w:val="single" w:sz="4" w:space="0" w:color="000000"/>
+              <w:bottom w:val="single" w:sz="4" w:space="0" w:color="000000"/>
+              <w:end w:val="single" w:sz="4" w:space="0" w:color="000000"/>
+            </w:tcBorders>
+          </w:tcPr>
+          <w:p>
+            <w:r>
+              <w:rPr>
+                <w:sz w:val="22"/>
+              </w:rPr>
+              <w:t>My first After was one question: “Where does 2/3 go?” My group pointed out that a student could put a dot in the right place by copying a neighbor, and I would learn nothing about how they decided. The genAI planning partner pushed the same way: what would a student write that shows equal parts rather than counted marks? So I added “How did you decide?” and the Sam question, because a line with extra tick marks is where counting shows up. I set aside the partner’s idea of a 0 to 2 line. It is a good question, but it is about fractions greater than 1, not my question.</w:t>
+            </w:r>
+          </w:p>
+        </w:tc>
+      </w:tr>
+    </w:tbl>
+    <w:p/>
     <w:tbl>
       <w:tblPr>
         <w:tblStyle w:val="Table7"/>

</xml_diff>